<commit_message>
Reemplaza presupuesto por cotizacion referencial con productos y enlaces de Decathlon Chile
Co-Authored-By: Claude Opus 4.8 <noreply@anthropic.com>
Claude-Session: https://claude.ai/code/session_01Ge42WYgiaxUXNLn8PretPQ
</commit_message>
<xml_diff>
--- a/Etapa1_NombreAlumno.docx
+++ b/Etapa1_NombreAlumno.docx
@@ -507,7 +507,7 @@
           <w:sz w:val="24"/>
           <w:szCs w:val="24"/>
         </w:rPr>
-        <w:t xml:space="preserve">5. Costos (presupuesto resumido)</w:t>
+        <w:t xml:space="preserve">5. Costos (cotización resumida)</w:t>
       </w:r>
     </w:p>
     <w:p>
@@ -520,7 +520,7 @@
           <w:sz w:val="24"/>
           <w:szCs w:val="24"/>
         </w:rPr>
-        <w:t xml:space="preserve">Presupuesto estimado de implementos a adquirir (valores referenciales en pesos):</w:t>
+        <w:t xml:space="preserve">Cotización referencial de implementos, en base a productos disponibles en Decathlon Chile (valores en pesos, sujetos a variación y promociones):</w:t>
       </w:r>
     </w:p>
     <w:tbl>
@@ -536,10 +536,10 @@
         </w:tblBorders>
       </w:tblPr>
       <w:tblGrid>
-        <w:gridCol w:w="3200"/>
-        <w:gridCol w:w="1400"/>
-        <w:gridCol w:w="1600"/>
-        <w:gridCol w:w="2100"/>
+        <w:gridCol w:w="3700"/>
+        <w:gridCol w:w="900"/>
+        <w:gridCol w:w="1850"/>
+        <w:gridCol w:w="1850"/>
       </w:tblGrid>
       <w:tr>
         <w:trPr>
@@ -547,7 +547,7 @@
         </w:trPr>
         <w:tc>
           <w:tcPr>
-            <w:tcW w:type="dxa" w:w="3200"/>
+            <w:tcW w:type="dxa" w:w="3700"/>
             <w:shd w:fill="D9E2F3" w:val="clear"/>
             <w:tcMar>
               <w:top w:type="dxa" w:w="40"/>
@@ -565,13 +565,13 @@
                 <w:sz w:val="24"/>
                 <w:szCs w:val="24"/>
               </w:rPr>
-              <w:t xml:space="preserve">Ítem</w:t>
-            </w:r>
-          </w:p>
-        </w:tc>
-        <w:tc>
-          <w:tcPr>
-            <w:tcW w:type="dxa" w:w="1400"/>
+              <w:t xml:space="preserve">Implemento / modelo (Decathlon Chile)</w:t>
+            </w:r>
+          </w:p>
+        </w:tc>
+        <w:tc>
+          <w:tcPr>
+            <w:tcW w:type="dxa" w:w="900"/>
             <w:shd w:fill="D9E2F3" w:val="clear"/>
             <w:tcMar>
               <w:top w:type="dxa" w:w="40"/>
@@ -589,13 +589,13 @@
                 <w:sz w:val="24"/>
                 <w:szCs w:val="24"/>
               </w:rPr>
-              <w:t xml:space="preserve">Cantidad</w:t>
-            </w:r>
-          </w:p>
-        </w:tc>
-        <w:tc>
-          <w:tcPr>
-            <w:tcW w:type="dxa" w:w="1600"/>
+              <w:t xml:space="preserve">Cant.</w:t>
+            </w:r>
+          </w:p>
+        </w:tc>
+        <w:tc>
+          <w:tcPr>
+            <w:tcW w:type="dxa" w:w="1850"/>
             <w:shd w:fill="D9E2F3" w:val="clear"/>
             <w:tcMar>
               <w:top w:type="dxa" w:w="40"/>
@@ -613,13 +613,13 @@
                 <w:sz w:val="24"/>
                 <w:szCs w:val="24"/>
               </w:rPr>
-              <w:t xml:space="preserve">Costo unit. ($)</w:t>
-            </w:r>
-          </w:p>
-        </w:tc>
-        <w:tc>
-          <w:tcPr>
-            <w:tcW w:type="dxa" w:w="2100"/>
+              <w:t xml:space="preserve">P. unit. ref. ($)</w:t>
+            </w:r>
+          </w:p>
+        </w:tc>
+        <w:tc>
+          <w:tcPr>
+            <w:tcW w:type="dxa" w:w="1850"/>
             <w:shd w:fill="D9E2F3" w:val="clear"/>
             <w:tcMar>
               <w:top w:type="dxa" w:w="40"/>
@@ -648,53 +648,53 @@
         </w:trPr>
         <w:tc>
           <w:tcPr>
-            <w:tcW w:type="dxa" w:w="3200"/>
-            <w:tcMar>
-              <w:top w:type="dxa" w:w="40"/>
-              <w:left w:type="dxa" w:w="80"/>
-              <w:bottom w:type="dxa" w:w="40"/>
-              <w:right w:type="dxa" w:w="80"/>
-            </w:tcMar>
-          </w:tcPr>
-          <w:p>
-            <w:r>
-              <w:rPr>
-                <w:rFonts w:ascii="Arial" w:cs="Arial" w:eastAsia="Arial" w:hAnsi="Arial"/>
-                <w:b w:val="false"/>
-                <w:bCs w:val="false"/>
-                <w:sz w:val="24"/>
-                <w:szCs w:val="24"/>
-              </w:rPr>
-              <w:t xml:space="preserve">Piso de goma / colchonetas</w:t>
-            </w:r>
-          </w:p>
-        </w:tc>
-        <w:tc>
-          <w:tcPr>
-            <w:tcW w:type="dxa" w:w="1400"/>
-            <w:tcMar>
-              <w:top w:type="dxa" w:w="40"/>
-              <w:left w:type="dxa" w:w="80"/>
-              <w:bottom w:type="dxa" w:w="40"/>
-              <w:right w:type="dxa" w:w="80"/>
-            </w:tcMar>
-          </w:tcPr>
-          <w:p>
-            <w:r>
-              <w:rPr>
-                <w:rFonts w:ascii="Arial" w:cs="Arial" w:eastAsia="Arial" w:hAnsi="Arial"/>
-                <w:b w:val="false"/>
-                <w:bCs w:val="false"/>
-                <w:sz w:val="24"/>
-                <w:szCs w:val="24"/>
-              </w:rPr>
-              <w:t xml:space="preserve">20</w:t>
-            </w:r>
-          </w:p>
-        </w:tc>
-        <w:tc>
-          <w:tcPr>
-            <w:tcW w:type="dxa" w:w="1600"/>
+            <w:tcW w:type="dxa" w:w="3700"/>
+            <w:tcMar>
+              <w:top w:type="dxa" w:w="40"/>
+              <w:left w:type="dxa" w:w="80"/>
+              <w:bottom w:type="dxa" w:w="40"/>
+              <w:right w:type="dxa" w:w="80"/>
+            </w:tcMar>
+          </w:tcPr>
+          <w:p>
+            <w:r>
+              <w:rPr>
+                <w:rFonts w:ascii="Arial" w:cs="Arial" w:eastAsia="Arial" w:hAnsi="Arial"/>
+                <w:b w:val="false"/>
+                <w:bCs w:val="false"/>
+                <w:sz w:val="24"/>
+                <w:szCs w:val="24"/>
+              </w:rPr>
+              <w:t xml:space="preserve">Mat Fitness 100 plegable (colchoneta) [1]</w:t>
+            </w:r>
+          </w:p>
+        </w:tc>
+        <w:tc>
+          <w:tcPr>
+            <w:tcW w:type="dxa" w:w="900"/>
+            <w:tcMar>
+              <w:top w:type="dxa" w:w="40"/>
+              <w:left w:type="dxa" w:w="80"/>
+              <w:bottom w:type="dxa" w:w="40"/>
+              <w:right w:type="dxa" w:w="80"/>
+            </w:tcMar>
+          </w:tcPr>
+          <w:p>
+            <w:r>
+              <w:rPr>
+                <w:rFonts w:ascii="Arial" w:cs="Arial" w:eastAsia="Arial" w:hAnsi="Arial"/>
+                <w:b w:val="false"/>
+                <w:bCs w:val="false"/>
+                <w:sz w:val="24"/>
+                <w:szCs w:val="24"/>
+              </w:rPr>
+              <w:t xml:space="preserve">6</w:t>
+            </w:r>
+          </w:p>
+        </w:tc>
+        <w:tc>
+          <w:tcPr>
+            <w:tcW w:type="dxa" w:w="1850"/>
             <w:tcMar>
               <w:top w:type="dxa" w:w="40"/>
               <w:left w:type="dxa" w:w="80"/>
@@ -717,24 +717,24 @@
         </w:tc>
         <w:tc>
           <w:tcPr>
-            <w:tcW w:type="dxa" w:w="2100"/>
-            <w:tcMar>
-              <w:top w:type="dxa" w:w="40"/>
-              <w:left w:type="dxa" w:w="80"/>
-              <w:bottom w:type="dxa" w:w="40"/>
-              <w:right w:type="dxa" w:w="80"/>
-            </w:tcMar>
-          </w:tcPr>
-          <w:p>
-            <w:r>
-              <w:rPr>
-                <w:rFonts w:ascii="Arial" w:cs="Arial" w:eastAsia="Arial" w:hAnsi="Arial"/>
-                <w:b w:val="false"/>
-                <w:bCs w:val="false"/>
-                <w:sz w:val="24"/>
-                <w:szCs w:val="24"/>
-              </w:rPr>
-              <w:t xml:space="preserve">500.000</w:t>
+            <w:tcW w:type="dxa" w:w="1850"/>
+            <w:tcMar>
+              <w:top w:type="dxa" w:w="40"/>
+              <w:left w:type="dxa" w:w="80"/>
+              <w:bottom w:type="dxa" w:w="40"/>
+              <w:right w:type="dxa" w:w="80"/>
+            </w:tcMar>
+          </w:tcPr>
+          <w:p>
+            <w:r>
+              <w:rPr>
+                <w:rFonts w:ascii="Arial" w:cs="Arial" w:eastAsia="Arial" w:hAnsi="Arial"/>
+                <w:b w:val="false"/>
+                <w:bCs w:val="false"/>
+                <w:sz w:val="24"/>
+                <w:szCs w:val="24"/>
+              </w:rPr>
+              <w:t xml:space="preserve">150.000</w:t>
             </w:r>
           </w:p>
         </w:tc>
@@ -745,30 +745,30 @@
         </w:trPr>
         <w:tc>
           <w:tcPr>
-            <w:tcW w:type="dxa" w:w="3200"/>
-            <w:tcMar>
-              <w:top w:type="dxa" w:w="40"/>
-              <w:left w:type="dxa" w:w="80"/>
-              <w:bottom w:type="dxa" w:w="40"/>
-              <w:right w:type="dxa" w:w="80"/>
-            </w:tcMar>
-          </w:tcPr>
-          <w:p>
-            <w:r>
-              <w:rPr>
-                <w:rFonts w:ascii="Arial" w:cs="Arial" w:eastAsia="Arial" w:hAnsi="Arial"/>
-                <w:b w:val="false"/>
-                <w:bCs w:val="false"/>
-                <w:sz w:val="24"/>
-                <w:szCs w:val="24"/>
-              </w:rPr>
-              <w:t xml:space="preserve">Set de mancuernas y barras</w:t>
-            </w:r>
-          </w:p>
-        </w:tc>
-        <w:tc>
-          <w:tcPr>
-            <w:tcW w:type="dxa" w:w="1400"/>
+            <w:tcW w:type="dxa" w:w="3700"/>
+            <w:tcMar>
+              <w:top w:type="dxa" w:w="40"/>
+              <w:left w:type="dxa" w:w="80"/>
+              <w:bottom w:type="dxa" w:w="40"/>
+              <w:right w:type="dxa" w:w="80"/>
+            </w:tcMar>
+          </w:tcPr>
+          <w:p>
+            <w:r>
+              <w:rPr>
+                <w:rFonts w:ascii="Arial" w:cs="Arial" w:eastAsia="Arial" w:hAnsi="Arial"/>
+                <w:b w:val="false"/>
+                <w:bCs w:val="false"/>
+                <w:sz w:val="24"/>
+                <w:szCs w:val="24"/>
+              </w:rPr>
+              <w:t xml:space="preserve">Kit de mancuernas 20 kg [2]</w:t>
+            </w:r>
+          </w:p>
+        </w:tc>
+        <w:tc>
+          <w:tcPr>
+            <w:tcW w:type="dxa" w:w="900"/>
             <w:tcMar>
               <w:top w:type="dxa" w:w="40"/>
               <w:left w:type="dxa" w:w="80"/>
@@ -791,47 +791,47 @@
         </w:tc>
         <w:tc>
           <w:tcPr>
-            <w:tcW w:type="dxa" w:w="1600"/>
-            <w:tcMar>
-              <w:top w:type="dxa" w:w="40"/>
-              <w:left w:type="dxa" w:w="80"/>
-              <w:bottom w:type="dxa" w:w="40"/>
-              <w:right w:type="dxa" w:w="80"/>
-            </w:tcMar>
-          </w:tcPr>
-          <w:p>
-            <w:r>
-              <w:rPr>
-                <w:rFonts w:ascii="Arial" w:cs="Arial" w:eastAsia="Arial" w:hAnsi="Arial"/>
-                <w:b w:val="false"/>
-                <w:bCs w:val="false"/>
-                <w:sz w:val="24"/>
-                <w:szCs w:val="24"/>
-              </w:rPr>
-              <w:t xml:space="preserve">180.000</w:t>
-            </w:r>
-          </w:p>
-        </w:tc>
-        <w:tc>
-          <w:tcPr>
-            <w:tcW w:type="dxa" w:w="2100"/>
-            <w:tcMar>
-              <w:top w:type="dxa" w:w="40"/>
-              <w:left w:type="dxa" w:w="80"/>
-              <w:bottom w:type="dxa" w:w="40"/>
-              <w:right w:type="dxa" w:w="80"/>
-            </w:tcMar>
-          </w:tcPr>
-          <w:p>
-            <w:r>
-              <w:rPr>
-                <w:rFonts w:ascii="Arial" w:cs="Arial" w:eastAsia="Arial" w:hAnsi="Arial"/>
-                <w:b w:val="false"/>
-                <w:bCs w:val="false"/>
-                <w:sz w:val="24"/>
-                <w:szCs w:val="24"/>
-              </w:rPr>
-              <w:t xml:space="preserve">360.000</w:t>
+            <w:tcW w:type="dxa" w:w="1850"/>
+            <w:tcMar>
+              <w:top w:type="dxa" w:w="40"/>
+              <w:left w:type="dxa" w:w="80"/>
+              <w:bottom w:type="dxa" w:w="40"/>
+              <w:right w:type="dxa" w:w="80"/>
+            </w:tcMar>
+          </w:tcPr>
+          <w:p>
+            <w:r>
+              <w:rPr>
+                <w:rFonts w:ascii="Arial" w:cs="Arial" w:eastAsia="Arial" w:hAnsi="Arial"/>
+                <w:b w:val="false"/>
+                <w:bCs w:val="false"/>
+                <w:sz w:val="24"/>
+                <w:szCs w:val="24"/>
+              </w:rPr>
+              <w:t xml:space="preserve">40.000</w:t>
+            </w:r>
+          </w:p>
+        </w:tc>
+        <w:tc>
+          <w:tcPr>
+            <w:tcW w:type="dxa" w:w="1850"/>
+            <w:tcMar>
+              <w:top w:type="dxa" w:w="40"/>
+              <w:left w:type="dxa" w:w="80"/>
+              <w:bottom w:type="dxa" w:w="40"/>
+              <w:right w:type="dxa" w:w="80"/>
+            </w:tcMar>
+          </w:tcPr>
+          <w:p>
+            <w:r>
+              <w:rPr>
+                <w:rFonts w:ascii="Arial" w:cs="Arial" w:eastAsia="Arial" w:hAnsi="Arial"/>
+                <w:b w:val="false"/>
+                <w:bCs w:val="false"/>
+                <w:sz w:val="24"/>
+                <w:szCs w:val="24"/>
+              </w:rPr>
+              <w:t xml:space="preserve">80.000</w:t>
             </w:r>
           </w:p>
         </w:tc>
@@ -842,30 +842,30 @@
         </w:trPr>
         <w:tc>
           <w:tcPr>
-            <w:tcW w:type="dxa" w:w="3200"/>
-            <w:tcMar>
-              <w:top w:type="dxa" w:w="40"/>
-              <w:left w:type="dxa" w:w="80"/>
-              <w:bottom w:type="dxa" w:w="40"/>
-              <w:right w:type="dxa" w:w="80"/>
-            </w:tcMar>
-          </w:tcPr>
-          <w:p>
-            <w:r>
-              <w:rPr>
-                <w:rFonts w:ascii="Arial" w:cs="Arial" w:eastAsia="Arial" w:hAnsi="Arial"/>
-                <w:b w:val="false"/>
-                <w:bCs w:val="false"/>
-                <w:sz w:val="24"/>
-                <w:szCs w:val="24"/>
-              </w:rPr>
-              <w:t xml:space="preserve">Bicicleta estática / elíptica</w:t>
-            </w:r>
-          </w:p>
-        </w:tc>
-        <w:tc>
-          <w:tcPr>
-            <w:tcW w:type="dxa" w:w="1400"/>
+            <w:tcW w:type="dxa" w:w="3700"/>
+            <w:tcMar>
+              <w:top w:type="dxa" w:w="40"/>
+              <w:left w:type="dxa" w:w="80"/>
+              <w:bottom w:type="dxa" w:w="40"/>
+              <w:right w:type="dxa" w:w="80"/>
+            </w:tcMar>
+          </w:tcPr>
+          <w:p>
+            <w:r>
+              <w:rPr>
+                <w:rFonts w:ascii="Arial" w:cs="Arial" w:eastAsia="Arial" w:hAnsi="Arial"/>
+                <w:b w:val="false"/>
+                <w:bCs w:val="false"/>
+                <w:sz w:val="24"/>
+                <w:szCs w:val="24"/>
+              </w:rPr>
+              <w:t xml:space="preserve">Set de mancuernas y barras 50 kg [3]</w:t>
+            </w:r>
+          </w:p>
+        </w:tc>
+        <w:tc>
+          <w:tcPr>
+            <w:tcW w:type="dxa" w:w="900"/>
             <w:tcMar>
               <w:top w:type="dxa" w:w="40"/>
               <w:left w:type="dxa" w:w="80"/>
@@ -888,47 +888,47 @@
         </w:tc>
         <w:tc>
           <w:tcPr>
-            <w:tcW w:type="dxa" w:w="1600"/>
-            <w:tcMar>
-              <w:top w:type="dxa" w:w="40"/>
-              <w:left w:type="dxa" w:w="80"/>
-              <w:bottom w:type="dxa" w:w="40"/>
-              <w:right w:type="dxa" w:w="80"/>
-            </w:tcMar>
-          </w:tcPr>
-          <w:p>
-            <w:r>
-              <w:rPr>
-                <w:rFonts w:ascii="Arial" w:cs="Arial" w:eastAsia="Arial" w:hAnsi="Arial"/>
-                <w:b w:val="false"/>
-                <w:bCs w:val="false"/>
-                <w:sz w:val="24"/>
-                <w:szCs w:val="24"/>
-              </w:rPr>
-              <w:t xml:space="preserve">250.000</w:t>
-            </w:r>
-          </w:p>
-        </w:tc>
-        <w:tc>
-          <w:tcPr>
-            <w:tcW w:type="dxa" w:w="2100"/>
-            <w:tcMar>
-              <w:top w:type="dxa" w:w="40"/>
-              <w:left w:type="dxa" w:w="80"/>
-              <w:bottom w:type="dxa" w:w="40"/>
-              <w:right w:type="dxa" w:w="80"/>
-            </w:tcMar>
-          </w:tcPr>
-          <w:p>
-            <w:r>
-              <w:rPr>
-                <w:rFonts w:ascii="Arial" w:cs="Arial" w:eastAsia="Arial" w:hAnsi="Arial"/>
-                <w:b w:val="false"/>
-                <w:bCs w:val="false"/>
-                <w:sz w:val="24"/>
-                <w:szCs w:val="24"/>
-              </w:rPr>
-              <w:t xml:space="preserve">500.000</w:t>
+            <w:tcW w:type="dxa" w:w="1850"/>
+            <w:tcMar>
+              <w:top w:type="dxa" w:w="40"/>
+              <w:left w:type="dxa" w:w="80"/>
+              <w:bottom w:type="dxa" w:w="40"/>
+              <w:right w:type="dxa" w:w="80"/>
+            </w:tcMar>
+          </w:tcPr>
+          <w:p>
+            <w:r>
+              <w:rPr>
+                <w:rFonts w:ascii="Arial" w:cs="Arial" w:eastAsia="Arial" w:hAnsi="Arial"/>
+                <w:b w:val="false"/>
+                <w:bCs w:val="false"/>
+                <w:sz w:val="24"/>
+                <w:szCs w:val="24"/>
+              </w:rPr>
+              <w:t xml:space="preserve">130.000</w:t>
+            </w:r>
+          </w:p>
+        </w:tc>
+        <w:tc>
+          <w:tcPr>
+            <w:tcW w:type="dxa" w:w="1850"/>
+            <w:tcMar>
+              <w:top w:type="dxa" w:w="40"/>
+              <w:left w:type="dxa" w:w="80"/>
+              <w:bottom w:type="dxa" w:w="40"/>
+              <w:right w:type="dxa" w:w="80"/>
+            </w:tcMar>
+          </w:tcPr>
+          <w:p>
+            <w:r>
+              <w:rPr>
+                <w:rFonts w:ascii="Arial" w:cs="Arial" w:eastAsia="Arial" w:hAnsi="Arial"/>
+                <w:b w:val="false"/>
+                <w:bCs w:val="false"/>
+                <w:sz w:val="24"/>
+                <w:szCs w:val="24"/>
+              </w:rPr>
+              <w:t xml:space="preserve">260.000</w:t>
             </w:r>
           </w:p>
         </w:tc>
@@ -939,93 +939,93 @@
         </w:trPr>
         <w:tc>
           <w:tcPr>
-            <w:tcW w:type="dxa" w:w="3200"/>
-            <w:tcMar>
-              <w:top w:type="dxa" w:w="40"/>
-              <w:left w:type="dxa" w:w="80"/>
-              <w:bottom w:type="dxa" w:w="40"/>
-              <w:right w:type="dxa" w:w="80"/>
-            </w:tcMar>
-          </w:tcPr>
-          <w:p>
-            <w:r>
-              <w:rPr>
-                <w:rFonts w:ascii="Arial" w:cs="Arial" w:eastAsia="Arial" w:hAnsi="Arial"/>
-                <w:b w:val="false"/>
-                <w:bCs w:val="false"/>
-                <w:sz w:val="24"/>
-                <w:szCs w:val="24"/>
-              </w:rPr>
-              <w:t xml:space="preserve">Bandas elásticas y accesorios</w:t>
-            </w:r>
-          </w:p>
-        </w:tc>
-        <w:tc>
-          <w:tcPr>
-            <w:tcW w:type="dxa" w:w="1400"/>
-            <w:tcMar>
-              <w:top w:type="dxa" w:w="40"/>
-              <w:left w:type="dxa" w:w="80"/>
-              <w:bottom w:type="dxa" w:w="40"/>
-              <w:right w:type="dxa" w:w="80"/>
-            </w:tcMar>
-          </w:tcPr>
-          <w:p>
-            <w:r>
-              <w:rPr>
-                <w:rFonts w:ascii="Arial" w:cs="Arial" w:eastAsia="Arial" w:hAnsi="Arial"/>
-                <w:b w:val="false"/>
-                <w:bCs w:val="false"/>
-                <w:sz w:val="24"/>
-                <w:szCs w:val="24"/>
-              </w:rPr>
-              <w:t xml:space="preserve">1 set</w:t>
-            </w:r>
-          </w:p>
-        </w:tc>
-        <w:tc>
-          <w:tcPr>
-            <w:tcW w:type="dxa" w:w="1600"/>
-            <w:tcMar>
-              <w:top w:type="dxa" w:w="40"/>
-              <w:left w:type="dxa" w:w="80"/>
-              <w:bottom w:type="dxa" w:w="40"/>
-              <w:right w:type="dxa" w:w="80"/>
-            </w:tcMar>
-          </w:tcPr>
-          <w:p>
-            <w:r>
-              <w:rPr>
-                <w:rFonts w:ascii="Arial" w:cs="Arial" w:eastAsia="Arial" w:hAnsi="Arial"/>
-                <w:b w:val="false"/>
-                <w:bCs w:val="false"/>
-                <w:sz w:val="24"/>
-                <w:szCs w:val="24"/>
-              </w:rPr>
-              <w:t xml:space="preserve">120.000</w:t>
-            </w:r>
-          </w:p>
-        </w:tc>
-        <w:tc>
-          <w:tcPr>
-            <w:tcW w:type="dxa" w:w="2100"/>
-            <w:tcMar>
-              <w:top w:type="dxa" w:w="40"/>
-              <w:left w:type="dxa" w:w="80"/>
-              <w:bottom w:type="dxa" w:w="40"/>
-              <w:right w:type="dxa" w:w="80"/>
-            </w:tcMar>
-          </w:tcPr>
-          <w:p>
-            <w:r>
-              <w:rPr>
-                <w:rFonts w:ascii="Arial" w:cs="Arial" w:eastAsia="Arial" w:hAnsi="Arial"/>
-                <w:b w:val="false"/>
-                <w:bCs w:val="false"/>
-                <w:sz w:val="24"/>
-                <w:szCs w:val="24"/>
-              </w:rPr>
-              <w:t xml:space="preserve">120.000</w:t>
+            <w:tcW w:type="dxa" w:w="3700"/>
+            <w:tcMar>
+              <w:top w:type="dxa" w:w="40"/>
+              <w:left w:type="dxa" w:w="80"/>
+              <w:bottom w:type="dxa" w:w="40"/>
+              <w:right w:type="dxa" w:w="80"/>
+            </w:tcMar>
+          </w:tcPr>
+          <w:p>
+            <w:r>
+              <w:rPr>
+                <w:rFonts w:ascii="Arial" w:cs="Arial" w:eastAsia="Arial" w:hAnsi="Arial"/>
+                <w:b w:val="false"/>
+                <w:bCs w:val="false"/>
+                <w:sz w:val="24"/>
+                <w:szCs w:val="24"/>
+              </w:rPr>
+              <w:t xml:space="preserve">Bicicleta estática EB140 [4]</w:t>
+            </w:r>
+          </w:p>
+        </w:tc>
+        <w:tc>
+          <w:tcPr>
+            <w:tcW w:type="dxa" w:w="900"/>
+            <w:tcMar>
+              <w:top w:type="dxa" w:w="40"/>
+              <w:left w:type="dxa" w:w="80"/>
+              <w:bottom w:type="dxa" w:w="40"/>
+              <w:right w:type="dxa" w:w="80"/>
+            </w:tcMar>
+          </w:tcPr>
+          <w:p>
+            <w:r>
+              <w:rPr>
+                <w:rFonts w:ascii="Arial" w:cs="Arial" w:eastAsia="Arial" w:hAnsi="Arial"/>
+                <w:b w:val="false"/>
+                <w:bCs w:val="false"/>
+                <w:sz w:val="24"/>
+                <w:szCs w:val="24"/>
+              </w:rPr>
+              <w:t xml:space="preserve">2</w:t>
+            </w:r>
+          </w:p>
+        </w:tc>
+        <w:tc>
+          <w:tcPr>
+            <w:tcW w:type="dxa" w:w="1850"/>
+            <w:tcMar>
+              <w:top w:type="dxa" w:w="40"/>
+              <w:left w:type="dxa" w:w="80"/>
+              <w:bottom w:type="dxa" w:w="40"/>
+              <w:right w:type="dxa" w:w="80"/>
+            </w:tcMar>
+          </w:tcPr>
+          <w:p>
+            <w:r>
+              <w:rPr>
+                <w:rFonts w:ascii="Arial" w:cs="Arial" w:eastAsia="Arial" w:hAnsi="Arial"/>
+                <w:b w:val="false"/>
+                <w:bCs w:val="false"/>
+                <w:sz w:val="24"/>
+                <w:szCs w:val="24"/>
+              </w:rPr>
+              <w:t xml:space="preserve">150.000</w:t>
+            </w:r>
+          </w:p>
+        </w:tc>
+        <w:tc>
+          <w:tcPr>
+            <w:tcW w:type="dxa" w:w="1850"/>
+            <w:tcMar>
+              <w:top w:type="dxa" w:w="40"/>
+              <w:left w:type="dxa" w:w="80"/>
+              <w:bottom w:type="dxa" w:w="40"/>
+              <w:right w:type="dxa" w:w="80"/>
+            </w:tcMar>
+          </w:tcPr>
+          <w:p>
+            <w:r>
+              <w:rPr>
+                <w:rFonts w:ascii="Arial" w:cs="Arial" w:eastAsia="Arial" w:hAnsi="Arial"/>
+                <w:b w:val="false"/>
+                <w:bCs w:val="false"/>
+                <w:sz w:val="24"/>
+                <w:szCs w:val="24"/>
+              </w:rPr>
+              <w:t xml:space="preserve">300.000</w:t>
             </w:r>
           </w:p>
         </w:tc>
@@ -1036,93 +1036,93 @@
         </w:trPr>
         <w:tc>
           <w:tcPr>
-            <w:tcW w:type="dxa" w:w="3200"/>
-            <w:tcMar>
-              <w:top w:type="dxa" w:w="40"/>
-              <w:left w:type="dxa" w:w="80"/>
-              <w:bottom w:type="dxa" w:w="40"/>
-              <w:right w:type="dxa" w:w="80"/>
-            </w:tcMar>
-          </w:tcPr>
-          <w:p>
-            <w:r>
-              <w:rPr>
-                <w:rFonts w:ascii="Arial" w:cs="Arial" w:eastAsia="Arial" w:hAnsi="Arial"/>
-                <w:b w:val="false"/>
-                <w:bCs w:val="false"/>
-                <w:sz w:val="24"/>
-                <w:szCs w:val="24"/>
-              </w:rPr>
-              <w:t xml:space="preserve">Espejo mural y ventilación</w:t>
-            </w:r>
-          </w:p>
-        </w:tc>
-        <w:tc>
-          <w:tcPr>
-            <w:tcW w:type="dxa" w:w="1400"/>
-            <w:tcMar>
-              <w:top w:type="dxa" w:w="40"/>
-              <w:left w:type="dxa" w:w="80"/>
-              <w:bottom w:type="dxa" w:w="40"/>
-              <w:right w:type="dxa" w:w="80"/>
-            </w:tcMar>
-          </w:tcPr>
-          <w:p>
-            <w:r>
-              <w:rPr>
-                <w:rFonts w:ascii="Arial" w:cs="Arial" w:eastAsia="Arial" w:hAnsi="Arial"/>
-                <w:b w:val="false"/>
-                <w:bCs w:val="false"/>
-                <w:sz w:val="24"/>
-                <w:szCs w:val="24"/>
-              </w:rPr>
-              <w:t xml:space="preserve">1</w:t>
-            </w:r>
-          </w:p>
-        </w:tc>
-        <w:tc>
-          <w:tcPr>
-            <w:tcW w:type="dxa" w:w="1600"/>
-            <w:tcMar>
-              <w:top w:type="dxa" w:w="40"/>
-              <w:left w:type="dxa" w:w="80"/>
-              <w:bottom w:type="dxa" w:w="40"/>
-              <w:right w:type="dxa" w:w="80"/>
-            </w:tcMar>
-          </w:tcPr>
-          <w:p>
-            <w:r>
-              <w:rPr>
-                <w:rFonts w:ascii="Arial" w:cs="Arial" w:eastAsia="Arial" w:hAnsi="Arial"/>
-                <w:b w:val="false"/>
-                <w:bCs w:val="false"/>
-                <w:sz w:val="24"/>
-                <w:szCs w:val="24"/>
-              </w:rPr>
-              <w:t xml:space="preserve">200.000</w:t>
-            </w:r>
-          </w:p>
-        </w:tc>
-        <w:tc>
-          <w:tcPr>
-            <w:tcW w:type="dxa" w:w="2100"/>
-            <w:tcMar>
-              <w:top w:type="dxa" w:w="40"/>
-              <w:left w:type="dxa" w:w="80"/>
-              <w:bottom w:type="dxa" w:w="40"/>
-              <w:right w:type="dxa" w:w="80"/>
-            </w:tcMar>
-          </w:tcPr>
-          <w:p>
-            <w:r>
-              <w:rPr>
-                <w:rFonts w:ascii="Arial" w:cs="Arial" w:eastAsia="Arial" w:hAnsi="Arial"/>
-                <w:b w:val="false"/>
-                <w:bCs w:val="false"/>
-                <w:sz w:val="24"/>
-                <w:szCs w:val="24"/>
-              </w:rPr>
-              <w:t xml:space="preserve">200.000</w:t>
+            <w:tcW w:type="dxa" w:w="3700"/>
+            <w:tcMar>
+              <w:top w:type="dxa" w:w="40"/>
+              <w:left w:type="dxa" w:w="80"/>
+              <w:bottom w:type="dxa" w:w="40"/>
+              <w:right w:type="dxa" w:w="80"/>
+            </w:tcMar>
+          </w:tcPr>
+          <w:p>
+            <w:r>
+              <w:rPr>
+                <w:rFonts w:ascii="Arial" w:cs="Arial" w:eastAsia="Arial" w:hAnsi="Arial"/>
+                <w:b w:val="false"/>
+                <w:bCs w:val="false"/>
+                <w:sz w:val="24"/>
+                <w:szCs w:val="24"/>
+              </w:rPr>
+              <w:t xml:space="preserve">Kit 3 bandas elásticas 5-6-7 kg [5]</w:t>
+            </w:r>
+          </w:p>
+        </w:tc>
+        <w:tc>
+          <w:tcPr>
+            <w:tcW w:type="dxa" w:w="900"/>
+            <w:tcMar>
+              <w:top w:type="dxa" w:w="40"/>
+              <w:left w:type="dxa" w:w="80"/>
+              <w:bottom w:type="dxa" w:w="40"/>
+              <w:right w:type="dxa" w:w="80"/>
+            </w:tcMar>
+          </w:tcPr>
+          <w:p>
+            <w:r>
+              <w:rPr>
+                <w:rFonts w:ascii="Arial" w:cs="Arial" w:eastAsia="Arial" w:hAnsi="Arial"/>
+                <w:b w:val="false"/>
+                <w:bCs w:val="false"/>
+                <w:sz w:val="24"/>
+                <w:szCs w:val="24"/>
+              </w:rPr>
+              <w:t xml:space="preserve">4</w:t>
+            </w:r>
+          </w:p>
+        </w:tc>
+        <w:tc>
+          <w:tcPr>
+            <w:tcW w:type="dxa" w:w="1850"/>
+            <w:tcMar>
+              <w:top w:type="dxa" w:w="40"/>
+              <w:left w:type="dxa" w:w="80"/>
+              <w:bottom w:type="dxa" w:w="40"/>
+              <w:right w:type="dxa" w:w="80"/>
+            </w:tcMar>
+          </w:tcPr>
+          <w:p>
+            <w:r>
+              <w:rPr>
+                <w:rFonts w:ascii="Arial" w:cs="Arial" w:eastAsia="Arial" w:hAnsi="Arial"/>
+                <w:b w:val="false"/>
+                <w:bCs w:val="false"/>
+                <w:sz w:val="24"/>
+                <w:szCs w:val="24"/>
+              </w:rPr>
+              <w:t xml:space="preserve">15.000</w:t>
+            </w:r>
+          </w:p>
+        </w:tc>
+        <w:tc>
+          <w:tcPr>
+            <w:tcW w:type="dxa" w:w="1850"/>
+            <w:tcMar>
+              <w:top w:type="dxa" w:w="40"/>
+              <w:left w:type="dxa" w:w="80"/>
+              <w:bottom w:type="dxa" w:w="40"/>
+              <w:right w:type="dxa" w:w="80"/>
+            </w:tcMar>
+          </w:tcPr>
+          <w:p>
+            <w:r>
+              <w:rPr>
+                <w:rFonts w:ascii="Arial" w:cs="Arial" w:eastAsia="Arial" w:hAnsi="Arial"/>
+                <w:b w:val="false"/>
+                <w:bCs w:val="false"/>
+                <w:sz w:val="24"/>
+                <w:szCs w:val="24"/>
+              </w:rPr>
+              <w:t xml:space="preserve">60.000</w:t>
             </w:r>
           </w:p>
         </w:tc>
@@ -1133,104 +1133,7 @@
         </w:trPr>
         <w:tc>
           <w:tcPr>
-            <w:tcW w:type="dxa" w:w="3200"/>
-            <w:tcMar>
-              <w:top w:type="dxa" w:w="40"/>
-              <w:left w:type="dxa" w:w="80"/>
-              <w:bottom w:type="dxa" w:w="40"/>
-              <w:right w:type="dxa" w:w="80"/>
-            </w:tcMar>
-          </w:tcPr>
-          <w:p>
-            <w:r>
-              <w:rPr>
-                <w:rFonts w:ascii="Arial" w:cs="Arial" w:eastAsia="Arial" w:hAnsi="Arial"/>
-                <w:b w:val="false"/>
-                <w:bCs w:val="false"/>
-                <w:sz w:val="24"/>
-                <w:szCs w:val="24"/>
-              </w:rPr>
-              <w:t xml:space="preserve">Dispensador de agua e higiene</w:t>
-            </w:r>
-          </w:p>
-        </w:tc>
-        <w:tc>
-          <w:tcPr>
-            <w:tcW w:type="dxa" w:w="1400"/>
-            <w:tcMar>
-              <w:top w:type="dxa" w:w="40"/>
-              <w:left w:type="dxa" w:w="80"/>
-              <w:bottom w:type="dxa" w:w="40"/>
-              <w:right w:type="dxa" w:w="80"/>
-            </w:tcMar>
-          </w:tcPr>
-          <w:p>
-            <w:r>
-              <w:rPr>
-                <w:rFonts w:ascii="Arial" w:cs="Arial" w:eastAsia="Arial" w:hAnsi="Arial"/>
-                <w:b w:val="false"/>
-                <w:bCs w:val="false"/>
-                <w:sz w:val="24"/>
-                <w:szCs w:val="24"/>
-              </w:rPr>
-              <w:t xml:space="preserve">1</w:t>
-            </w:r>
-          </w:p>
-        </w:tc>
-        <w:tc>
-          <w:tcPr>
-            <w:tcW w:type="dxa" w:w="1600"/>
-            <w:tcMar>
-              <w:top w:type="dxa" w:w="40"/>
-              <w:left w:type="dxa" w:w="80"/>
-              <w:bottom w:type="dxa" w:w="40"/>
-              <w:right w:type="dxa" w:w="80"/>
-            </w:tcMar>
-          </w:tcPr>
-          <w:p>
-            <w:r>
-              <w:rPr>
-                <w:rFonts w:ascii="Arial" w:cs="Arial" w:eastAsia="Arial" w:hAnsi="Arial"/>
-                <w:b w:val="false"/>
-                <w:bCs w:val="false"/>
-                <w:sz w:val="24"/>
-                <w:szCs w:val="24"/>
-              </w:rPr>
-              <w:t xml:space="preserve">120.000</w:t>
-            </w:r>
-          </w:p>
-        </w:tc>
-        <w:tc>
-          <w:tcPr>
-            <w:tcW w:type="dxa" w:w="2100"/>
-            <w:tcMar>
-              <w:top w:type="dxa" w:w="40"/>
-              <w:left w:type="dxa" w:w="80"/>
-              <w:bottom w:type="dxa" w:w="40"/>
-              <w:right w:type="dxa" w:w="80"/>
-            </w:tcMar>
-          </w:tcPr>
-          <w:p>
-            <w:r>
-              <w:rPr>
-                <w:rFonts w:ascii="Arial" w:cs="Arial" w:eastAsia="Arial" w:hAnsi="Arial"/>
-                <w:b w:val="false"/>
-                <w:bCs w:val="false"/>
-                <w:sz w:val="24"/>
-                <w:szCs w:val="24"/>
-              </w:rPr>
-              <w:t xml:space="preserve">120.000</w:t>
-            </w:r>
-          </w:p>
-        </w:tc>
-      </w:tr>
-      <w:tr>
-        <w:trPr>
-          <w:tblHeader w:val="false"/>
-        </w:trPr>
-        <w:tc>
-          <w:tcPr>
-            <w:tcW w:type="dxa" w:w="3200"/>
+            <w:tcW w:type="dxa" w:w="3700"/>
             <w:tcMar>
               <w:top w:type="dxa" w:w="40"/>
               <w:left w:type="dxa" w:w="80"/>
@@ -1253,7 +1156,7 @@
         </w:tc>
         <w:tc>
           <w:tcPr>
-            <w:tcW w:type="dxa" w:w="1400"/>
+            <w:tcW w:type="dxa" w:w="900"/>
             <w:tcMar>
               <w:top w:type="dxa" w:w="40"/>
               <w:left w:type="dxa" w:w="80"/>
@@ -1276,7 +1179,7 @@
         </w:tc>
         <w:tc>
           <w:tcPr>
-            <w:tcW w:type="dxa" w:w="1600"/>
+            <w:tcW w:type="dxa" w:w="1850"/>
             <w:tcMar>
               <w:top w:type="dxa" w:w="40"/>
               <w:left w:type="dxa" w:w="80"/>
@@ -1299,7 +1202,7 @@
         </w:tc>
         <w:tc>
           <w:tcPr>
-            <w:tcW w:type="dxa" w:w="2100"/>
+            <w:tcW w:type="dxa" w:w="1850"/>
             <w:tcMar>
               <w:top w:type="dxa" w:w="40"/>
               <w:left w:type="dxa" w:w="80"/>
@@ -1316,7 +1219,7 @@
                 <w:sz w:val="24"/>
                 <w:szCs w:val="24"/>
               </w:rPr>
-              <w:t xml:space="preserve">1.800.000</w:t>
+              <w:t xml:space="preserve">850.000</w:t>
             </w:r>
           </w:p>
         </w:tc>
@@ -1326,6 +1229,89 @@
       <w:pPr>
         <w:spacing w:before="120"/>
       </w:pPr>
+      <w:r>
+        <w:rPr>
+          <w:rFonts w:ascii="Arial" w:cs="Arial" w:eastAsia="Arial" w:hAnsi="Arial"/>
+          <w:b/>
+          <w:bCs/>
+          <w:color w:val="555555"/>
+          <w:sz w:val="18"/>
+          <w:szCs w:val="18"/>
+        </w:rPr>
+        <w:t xml:space="preserve">Enlaces de referencia (Decathlon Chile):</w:t>
+      </w:r>
+    </w:p>
+    <w:p>
+      <w:pPr>
+        <w:spacing w:after="20"/>
+      </w:pPr>
+      <w:r>
+        <w:rPr>
+          <w:rFonts w:ascii="Arial" w:cs="Arial" w:eastAsia="Arial" w:hAnsi="Arial"/>
+          <w:color w:val="555555"/>
+          <w:sz w:val="16"/>
+          <w:szCs w:val="16"/>
+        </w:rPr>
+        <w:t xml:space="preserve">[1] www.decathlon.cl/p/333012-37548-mat-fitness-100-azul-plegable-160-cm-x-58-cm-x-7-mm.html</w:t>
+      </w:r>
+    </w:p>
+    <w:p>
+      <w:pPr>
+        <w:spacing w:after="20"/>
+      </w:pPr>
+      <w:r>
+        <w:rPr>
+          <w:rFonts w:ascii="Arial" w:cs="Arial" w:eastAsia="Arial" w:hAnsi="Arial"/>
+          <w:color w:val="555555"/>
+          <w:sz w:val="16"/>
+          <w:szCs w:val="16"/>
+        </w:rPr>
+        <w:t xml:space="preserve">[2] www.decathlon.cl/p/8491831_kit-de-mancuernas-20-kg.html</w:t>
+      </w:r>
+    </w:p>
+    <w:p>
+      <w:pPr>
+        <w:spacing w:after="20"/>
+      </w:pPr>
+      <w:r>
+        <w:rPr>
+          <w:rFonts w:ascii="Arial" w:cs="Arial" w:eastAsia="Arial" w:hAnsi="Arial"/>
+          <w:color w:val="555555"/>
+          <w:sz w:val="16"/>
+          <w:szCs w:val="16"/>
+        </w:rPr>
+        <w:t xml:space="preserve">[3] www.decathlon.cl/discos-y-barras/301315-5277-kit-de-pesas-y-barras-de-musculacion-de-50-kg.html</w:t>
+      </w:r>
+    </w:p>
+    <w:p>
+      <w:pPr>
+        <w:spacing w:after="20"/>
+      </w:pPr>
+      <w:r>
+        <w:rPr>
+          <w:rFonts w:ascii="Arial" w:cs="Arial" w:eastAsia="Arial" w:hAnsi="Arial"/>
+          <w:color w:val="555555"/>
+          <w:sz w:val="16"/>
+          <w:szCs w:val="16"/>
+        </w:rPr>
+        <w:t xml:space="preserve">[4] www.decathlon.cl/p/8543290_bicicleta-estatica-eb140.html</w:t>
+      </w:r>
+    </w:p>
+    <w:p>
+      <w:pPr>
+        <w:spacing w:after="60"/>
+      </w:pPr>
+      <w:r>
+        <w:rPr>
+          <w:rFonts w:ascii="Arial" w:cs="Arial" w:eastAsia="Arial" w:hAnsi="Arial"/>
+          <w:color w:val="555555"/>
+          <w:sz w:val="16"/>
+          <w:szCs w:val="16"/>
+        </w:rPr>
+        <w:t xml:space="preserve">[5] www.decathlon.cl/p/305336-12906-kit-3-bandas-elasticas-fitness-resistencia-5-6-7-kg-gris-burdeos-negro.html</w:t>
+      </w:r>
+    </w:p>
+    <w:p>
       <w:r>
         <w:rPr>
           <w:rFonts w:ascii="Arial" w:cs="Arial" w:eastAsia="Arial" w:hAnsi="Arial"/>
@@ -1335,7 +1321,7 @@
           <w:sz w:val="18"/>
           <w:szCs w:val="18"/>
         </w:rPr>
-        <w:t xml:space="preserve">Fuente: Organización Mundial de la Salud (OMS), Directrices sobre actividad física, 2020.</w:t>
+        <w:t xml:space="preserve">Fuente de fundamentación: Organización Mundial de la Salud (OMS), Directrices sobre actividad física, 2020.</w:t>
       </w:r>
     </w:p>
     <w:sectPr>

</xml_diff>